<commit_message>
Change as pu-change.csv. Add cjk-b and cjk-c styles.
</commit_message>
<xml_diff>
--- a/hysc.docx
+++ b/hysc.docx
@@ -4815,6 +4815,26 @@
       <w:lang w:val="en-US" w:eastAsia="zh-CN"/>
     </w:rPr>
   </w:style>
+  <w:style w:type="character" w:customStyle="1" w:styleId="24">
+    <w:name w:val="cjk-c"/>
+    <w:basedOn w:val="10"/>
+    <w:qFormat/>
+    <w:uiPriority w:val="0"/>
+    <w:rPr>
+      <w:rFonts w:ascii="Calibri" w:hAnsi="Calibri" w:eastAsia="Hanazono Mincho C"/>
+      <w:sz w:val="22"/>
+    </w:rPr>
+  </w:style>
+  <w:style w:type="character" w:customStyle="1" w:styleId="25">
+    <w:name w:val="cjk-b"/>
+    <w:basedOn w:val="10"/>
+    <w:qFormat/>
+    <w:uiPriority w:val="0"/>
+    <w:rPr>
+      <w:rFonts w:ascii="Calibri" w:hAnsi="Calibri" w:eastAsia="HanaMinB"/>
+      <w:sz w:val="22"/>
+    </w:rPr>
+  </w:style>
 </w:styles>
 </file>
 

</xml_diff>